<commit_message>
2.01 update link to the ICA tutorial
</commit_message>
<xml_diff>
--- a/Manuels/Manuel_ICA_module.docx
+++ b/Manuels/Manuel_ICA_module.docx
@@ -17,10 +17,11 @@
           <w:kern w:val="2"/>
           <w:sz w:val="40"/>
           <w:szCs w:val="40"/>
-          <w:lang w:val="fr-CH"/>
+          <w:lang w:val="en-US"/>
           <w14:ligatures w14:val="standardContextual"/>
         </w:rPr>
       </w:pPr>
+      <w:proofErr w:type="spellStart"/>
       <w:r>
         <w:rPr>
           <w:b w:val="0"/>
@@ -29,10 +30,24 @@
           <w:iCs w:val="0"/>
           <w:color w:val="2F5496" w:themeColor="accent1" w:themeShade="BF"/>
           <w:kern w:val="2"/>
-          <w:lang w:val="fr-CH"/>
+          <w:lang w:val="en-US"/>
           <w14:ligatures w14:val="standardContextual"/>
         </w:rPr>
-        <w:t xml:space="preserve">EEGpal: </w:t>
+        <w:t>EEGpal</w:t>
+      </w:r>
+      <w:proofErr w:type="spellEnd"/>
+      <w:r>
+        <w:rPr>
+          <w:b w:val="0"/>
+          <w:bCs w:val="0"/>
+          <w:i w:val="0"/>
+          <w:iCs w:val="0"/>
+          <w:color w:val="2F5496" w:themeColor="accent1" w:themeShade="BF"/>
+          <w:kern w:val="2"/>
+          <w:lang w:val="en-US"/>
+          <w14:ligatures w14:val="standardContextual"/>
+        </w:rPr>
+        <w:t xml:space="preserve">: </w:t>
       </w:r>
       <w:r>
         <w:rPr>
@@ -44,7 +59,7 @@
           <w:kern w:val="2"/>
           <w:sz w:val="40"/>
           <w:szCs w:val="40"/>
-          <w:lang w:val="fr-CH"/>
+          <w:lang w:val="en-US"/>
           <w14:ligatures w14:val="standardContextual"/>
         </w:rPr>
         <w:t>ICA module</w:t>
@@ -56,76 +71,76 @@
         <w:ind w:firstLine="0"/>
         <w:rPr>
           <w:rFonts w:ascii="Calibri" w:hAnsi="Calibri" w:cs="Calibri"/>
-          <w:lang w:val="fr-CH"/>
-        </w:rPr>
-      </w:pPr>
-      <w:r>
-        <w:rPr>
-          <w:rFonts w:ascii="Calibri" w:hAnsi="Calibri" w:cs="Calibri"/>
-          <w:lang w:val="fr-CH"/>
+          <w:lang w:val="en-US"/>
+        </w:rPr>
+      </w:pPr>
+      <w:r>
+        <w:rPr>
+          <w:rFonts w:ascii="Calibri" w:hAnsi="Calibri" w:cs="Calibri"/>
+          <w:lang w:val="en-US"/>
         </w:rPr>
         <w:t xml:space="preserve">Version </w:t>
       </w:r>
       <w:r>
         <w:rPr>
           <w:rFonts w:ascii="Calibri" w:hAnsi="Calibri" w:cs="Calibri"/>
-          <w:lang w:val="fr-CH"/>
+          <w:lang w:val="en-US"/>
         </w:rPr>
         <w:t>2</w:t>
       </w:r>
       <w:r>
         <w:rPr>
           <w:rFonts w:ascii="Calibri" w:hAnsi="Calibri" w:cs="Calibri"/>
-          <w:lang w:val="fr-CH"/>
+          <w:lang w:val="en-US"/>
         </w:rPr>
         <w:t>.0</w:t>
       </w:r>
       <w:r>
         <w:rPr>
           <w:rFonts w:ascii="Calibri" w:hAnsi="Calibri" w:cs="Calibri"/>
-          <w:lang w:val="fr-CH"/>
+          <w:lang w:val="en-US"/>
         </w:rPr>
         <w:t>1</w:t>
       </w:r>
       <w:r>
         <w:rPr>
           <w:rFonts w:ascii="Calibri" w:hAnsi="Calibri" w:cs="Calibri"/>
-          <w:lang w:val="fr-CH"/>
+          <w:lang w:val="en-US"/>
         </w:rPr>
         <w:t xml:space="preserve">, </w:t>
       </w:r>
       <w:r>
         <w:rPr>
           <w:rFonts w:ascii="Calibri" w:hAnsi="Calibri" w:cs="Calibri"/>
-          <w:lang w:val="fr-CH"/>
+          <w:lang w:val="en-US"/>
         </w:rPr>
         <w:t>20</w:t>
       </w:r>
       <w:r>
         <w:rPr>
           <w:rFonts w:ascii="Calibri" w:hAnsi="Calibri" w:cs="Calibri"/>
-          <w:lang w:val="fr-CH"/>
+          <w:lang w:val="en-US"/>
         </w:rPr>
         <w:t>.</w:t>
       </w:r>
       <w:r>
         <w:rPr>
           <w:rFonts w:ascii="Calibri" w:hAnsi="Calibri" w:cs="Calibri"/>
-          <w:lang w:val="fr-CH"/>
+          <w:lang w:val="en-US"/>
         </w:rPr>
         <w:t>11</w:t>
       </w:r>
       <w:r>
         <w:rPr>
           <w:rFonts w:ascii="Calibri" w:hAnsi="Calibri" w:cs="Calibri"/>
-          <w:lang w:val="fr-CH"/>
+          <w:lang w:val="en-US"/>
         </w:rPr>
         <w:t>.202</w:t>
       </w:r>
       <w:r>
         <w:rPr>
           <w:rFonts w:ascii="Calibri" w:hAnsi="Calibri" w:cs="Calibri"/>
-          <w:lang w:val="fr-CH"/>
+          <w:lang w:val="en-US"/>
         </w:rPr>
         <w:t>5</w:t>
       </w:r>
@@ -135,7 +150,6 @@
         <w:spacing w:line="240" w:lineRule="auto"/>
         <w:ind w:firstLine="0"/>
         <w:rPr>
-          <w:rFonts w:ascii="Calibri" w:hAnsi="Calibri" w:cs="Calibri"/>
           <w:lang w:val="en-US"/>
         </w:rPr>
       </w:pPr>
@@ -150,10 +164,9 @@
         <w:r>
           <w:rPr>
             <w:rStyle w:val="Hyperlink"/>
-            <w:rFonts w:ascii="Calibri" w:hAnsi="Calibri" w:cs="Calibri"/>
             <w:lang w:val="en-US"/>
           </w:rPr>
-          <w:t>https://youtu.be/zEdVn9W0hE4</w:t>
+          <w:t>https://www.youtube.com/watch?v=PGzbCEqjD5w</w:t>
         </w:r>
       </w:hyperlink>
     </w:p>
@@ -226,6 +239,7 @@
         </w:rPr>
         <w:t xml:space="preserve"> the function </w:t>
       </w:r>
+      <w:proofErr w:type="spellStart"/>
       <w:r>
         <w:rPr>
           <w:i/>
@@ -234,11 +248,26 @@
         </w:rPr>
         <w:t>runica</w:t>
       </w:r>
-      <w:r>
-        <w:rPr>
-          <w:lang w:val="en-US"/>
-        </w:rPr>
-        <w:t xml:space="preserve"> developed for eeglab </w:t>
+      <w:proofErr w:type="spellEnd"/>
+      <w:r>
+        <w:rPr>
+          <w:lang w:val="en-US"/>
+        </w:rPr>
+        <w:t xml:space="preserve"> developed for </w:t>
+      </w:r>
+      <w:proofErr w:type="spellStart"/>
+      <w:r>
+        <w:rPr>
+          <w:lang w:val="en-US"/>
+        </w:rPr>
+        <w:t>eeglab</w:t>
+      </w:r>
+      <w:proofErr w:type="spellEnd"/>
+      <w:r>
+        <w:rPr>
+          <w:lang w:val="en-US"/>
+        </w:rPr>
+        <w:t xml:space="preserve"> </w:t>
       </w:r>
       <w:r>
         <w:rPr>
@@ -256,7 +285,21 @@
         <w:rPr>
           <w:lang w:val="en-US"/>
         </w:rPr>
-        <w:t>Cichocki &amp; Yang, the extended-ICA algorithm of Lee, Girolami &amp; Sejnowski, PCA dimension reduction, and/or specgram() preprocessing</w:t>
+        <w:t xml:space="preserve">Cichocki &amp; Yang, the extended-ICA algorithm of Lee, Girolami &amp; Sejnowski, PCA dimension reduction, and/or </w:t>
+      </w:r>
+      <w:proofErr w:type="spellStart"/>
+      <w:r>
+        <w:rPr>
+          <w:lang w:val="en-US"/>
+        </w:rPr>
+        <w:t>specgram</w:t>
+      </w:r>
+      <w:proofErr w:type="spellEnd"/>
+      <w:r>
+        <w:rPr>
+          <w:lang w:val="en-US"/>
+        </w:rPr>
+        <w:t>() preprocessing</w:t>
       </w:r>
       <w:r>
         <w:rPr>
@@ -379,6 +422,7 @@
         </w:rPr>
         <w:t>./</w:t>
       </w:r>
+      <w:proofErr w:type="spellStart"/>
       <w:r>
         <w:rPr>
           <w:i/>
@@ -387,6 +431,7 @@
         </w:rPr>
         <w:t>temp_ICA</w:t>
       </w:r>
+      <w:proofErr w:type="spellEnd"/>
       <w:r>
         <w:rPr>
           <w:lang w:val="en-US"/>
@@ -398,7 +443,21 @@
           <w:lang w:val="en-US"/>
         </w:rPr>
         <w:lastRenderedPageBreak/>
-        <w:t>format. If you have already performed the decomposition (step 1), you can load these intermediate files directly into the main EEGpal window. The ICA module will automatically detect that the decomposition has already been performed.</w:t>
+        <w:t xml:space="preserve">format. If you have already performed the decomposition (step 1), you can load these intermediate files directly into the main </w:t>
+      </w:r>
+      <w:proofErr w:type="spellStart"/>
+      <w:r>
+        <w:rPr>
+          <w:lang w:val="en-US"/>
+        </w:rPr>
+        <w:t>EEGpal</w:t>
+      </w:r>
+      <w:proofErr w:type="spellEnd"/>
+      <w:r>
+        <w:rPr>
+          <w:lang w:val="en-US"/>
+        </w:rPr>
+        <w:t xml:space="preserve"> window. The ICA module will automatically detect that the decomposition has already been performed.</w:t>
       </w:r>
     </w:p>
     <w:p>
@@ -458,7 +517,21 @@
         <w:rPr>
           <w:lang w:val="en-US"/>
         </w:rPr>
-        <w:t>To avoid introducing processing variability into your results, it is strongly recommended that you perform a single ICA decomposition (concatenate files). This option is activated by default if you have specified a subject code for each file in the input data table in the main EEGpal window.</w:t>
+        <w:t xml:space="preserve">To avoid introducing processing variability into your results, it is strongly recommended that you perform a single ICA decomposition (concatenate files). This option is activated by default if you have specified a subject code for each file in the input data table in the main </w:t>
+      </w:r>
+      <w:proofErr w:type="spellStart"/>
+      <w:r>
+        <w:rPr>
+          <w:lang w:val="en-US"/>
+        </w:rPr>
+        <w:t>EEGpal</w:t>
+      </w:r>
+      <w:proofErr w:type="spellEnd"/>
+      <w:r>
+        <w:rPr>
+          <w:lang w:val="en-US"/>
+        </w:rPr>
+        <w:t xml:space="preserve"> window.</w:t>
       </w:r>
       <w:r>
         <w:rPr>
@@ -646,7 +719,21 @@
         <w:rPr>
           <w:lang w:val="en-US"/>
         </w:rPr>
-        <w:t xml:space="preserve"> module in EEGpal before ICA, the list of bridged channels will automatically be filled in the bad channel table in point 2. You can activate or deactivate </w:t>
+        <w:t xml:space="preserve"> module in </w:t>
+      </w:r>
+      <w:proofErr w:type="spellStart"/>
+      <w:r>
+        <w:rPr>
+          <w:lang w:val="en-US"/>
+        </w:rPr>
+        <w:t>EEGpal</w:t>
+      </w:r>
+      <w:proofErr w:type="spellEnd"/>
+      <w:r>
+        <w:rPr>
+          <w:lang w:val="en-US"/>
+        </w:rPr>
+        <w:t xml:space="preserve"> before ICA, the list of bridged channels will automatically be filled in the bad channel table in point 2. You can activate or deactivate </w:t>
       </w:r>
       <w:r>
         <w:rPr>
@@ -751,8 +838,36 @@
           <w:iCs/>
           <w:lang w:val="en-US"/>
         </w:rPr>
-        <w:t>.\ICAtemp\decomposed\*_ICAdecomposed.set</w:t>
-      </w:r>
+        <w:t>.\</w:t>
+      </w:r>
+      <w:proofErr w:type="spellStart"/>
+      <w:r>
+        <w:rPr>
+          <w:i/>
+          <w:iCs/>
+          <w:lang w:val="en-US"/>
+        </w:rPr>
+        <w:t>ICAtemp</w:t>
+      </w:r>
+      <w:proofErr w:type="spellEnd"/>
+      <w:r>
+        <w:rPr>
+          <w:i/>
+          <w:iCs/>
+          <w:lang w:val="en-US"/>
+        </w:rPr>
+        <w:t>\decomposed\*_</w:t>
+      </w:r>
+      <w:proofErr w:type="spellStart"/>
+      <w:r>
+        <w:rPr>
+          <w:i/>
+          <w:iCs/>
+          <w:lang w:val="en-US"/>
+        </w:rPr>
+        <w:t>ICAdecomposed.set</w:t>
+      </w:r>
+      <w:proofErr w:type="spellEnd"/>
       <w:r>
         <w:rPr>
           <w:lang w:val="en-US"/>
@@ -872,17 +987,53 @@
           <w:lang w:val="en-US"/>
         </w:rPr>
       </w:pPr>
-      <w:r>
-        <w:rPr>
-          <w:lang w:val="en-US"/>
-        </w:rPr>
-        <w:t xml:space="preserve">EEGpal will </w:t>
-      </w:r>
-      <w:r>
-        <w:rPr>
-          <w:lang w:val="en-US"/>
-        </w:rPr>
-        <w:t>automatically consult the ICLabel module included in eeglab (</w:t>
+      <w:proofErr w:type="spellStart"/>
+      <w:r>
+        <w:rPr>
+          <w:lang w:val="en-US"/>
+        </w:rPr>
+        <w:t>EEGpal</w:t>
+      </w:r>
+      <w:proofErr w:type="spellEnd"/>
+      <w:r>
+        <w:rPr>
+          <w:lang w:val="en-US"/>
+        </w:rPr>
+        <w:t xml:space="preserve"> will </w:t>
+      </w:r>
+      <w:r>
+        <w:rPr>
+          <w:lang w:val="en-US"/>
+        </w:rPr>
+        <w:t xml:space="preserve">automatically consult the </w:t>
+      </w:r>
+      <w:proofErr w:type="spellStart"/>
+      <w:r>
+        <w:rPr>
+          <w:lang w:val="en-US"/>
+        </w:rPr>
+        <w:t>ICLabel</w:t>
+      </w:r>
+      <w:proofErr w:type="spellEnd"/>
+      <w:r>
+        <w:rPr>
+          <w:lang w:val="en-US"/>
+        </w:rPr>
+        <w:t xml:space="preserve"> module included in </w:t>
+      </w:r>
+      <w:proofErr w:type="spellStart"/>
+      <w:r>
+        <w:rPr>
+          <w:lang w:val="en-US"/>
+        </w:rPr>
+        <w:t>eeglab</w:t>
+      </w:r>
+      <w:proofErr w:type="spellEnd"/>
+      <w:r>
+        <w:rPr>
+          <w:lang w:val="en-US"/>
+        </w:rPr>
+        <w:t xml:space="preserve"> (</w:t>
       </w:r>
       <w:hyperlink r:id="rId9" w:history="1">
         <w:r>
@@ -995,7 +1146,21 @@
         <w:rPr>
           <w:lang w:val="en-US"/>
         </w:rPr>
-        <w:t>The toolbox will display the topography of the first X components (X as specified in point 5) alongside the labels estimated by ICAlabel.</w:t>
+        <w:t xml:space="preserve">The toolbox will display the topography of the first X components (X as specified in point 5) alongside the labels estimated by </w:t>
+      </w:r>
+      <w:proofErr w:type="spellStart"/>
+      <w:r>
+        <w:rPr>
+          <w:lang w:val="en-US"/>
+        </w:rPr>
+        <w:t>ICAlabel</w:t>
+      </w:r>
+      <w:proofErr w:type="spellEnd"/>
+      <w:r>
+        <w:rPr>
+          <w:lang w:val="en-US"/>
+        </w:rPr>
+        <w:t>.</w:t>
       </w:r>
       <w:r>
         <w:rPr>
@@ -1152,8 +1317,23 @@
         <w:rPr>
           <w:lang w:val="en-US"/>
         </w:rPr>
-        <w:t xml:space="preserve"> the coloumn </w:t>
-      </w:r>
+        <w:t xml:space="preserve"> the </w:t>
+      </w:r>
+      <w:proofErr w:type="spellStart"/>
+      <w:r>
+        <w:rPr>
+          <w:lang w:val="en-US"/>
+        </w:rPr>
+        <w:t>coloumn</w:t>
+      </w:r>
+      <w:proofErr w:type="spellEnd"/>
+      <w:r>
+        <w:rPr>
+          <w:lang w:val="en-US"/>
+        </w:rPr>
+        <w:t xml:space="preserve"> </w:t>
+      </w:r>
+      <w:proofErr w:type="spellStart"/>
       <w:r>
         <w:rPr>
           <w:i/>
@@ -1162,6 +1342,7 @@
         </w:rPr>
         <w:t>Components_to_remove</w:t>
       </w:r>
+      <w:proofErr w:type="spellEnd"/>
       <w:r>
         <w:rPr>
           <w:lang w:val="en-US"/>
@@ -1174,7 +1355,25 @@
           <w:iCs/>
           <w:lang w:val="en-US"/>
         </w:rPr>
-        <w:t>'Concatenare files from same subjects</w:t>
+        <w:t>'</w:t>
+      </w:r>
+      <w:proofErr w:type="spellStart"/>
+      <w:r>
+        <w:rPr>
+          <w:i/>
+          <w:iCs/>
+          <w:lang w:val="en-US"/>
+        </w:rPr>
+        <w:t>Concatenare</w:t>
+      </w:r>
+      <w:proofErr w:type="spellEnd"/>
+      <w:r>
+        <w:rPr>
+          <w:i/>
+          <w:iCs/>
+          <w:lang w:val="en-US"/>
+        </w:rPr>
+        <w:t xml:space="preserve"> files from same subjects</w:t>
       </w:r>
       <w:r>
         <w:rPr>
@@ -1220,7 +1419,21 @@
         <w:rPr>
           <w:lang w:val="en-US"/>
         </w:rPr>
-        <w:t>Full automatic selection of bad components. Clicking this button applies the ICLabel suggestion from point 6 without any visual inspection.</w:t>
+        <w:t xml:space="preserve">Full automatic selection of bad components. Clicking this button applies the </w:t>
+      </w:r>
+      <w:proofErr w:type="spellStart"/>
+      <w:r>
+        <w:rPr>
+          <w:lang w:val="en-US"/>
+        </w:rPr>
+        <w:t>ICLabel</w:t>
+      </w:r>
+      <w:proofErr w:type="spellEnd"/>
+      <w:r>
+        <w:rPr>
+          <w:lang w:val="en-US"/>
+        </w:rPr>
+        <w:t xml:space="preserve"> suggestion from point 6 without any visual inspection.</w:t>
       </w:r>
       <w:r>
         <w:rPr>
@@ -1317,7 +1530,25 @@
           <w:bCs/>
           <w:lang w:val="en-US"/>
         </w:rPr>
-        <w:t xml:space="preserve"> Signal recomposition without bad components and output save</w:t>
+        <w:t xml:space="preserve"> Signal </w:t>
+      </w:r>
+      <w:proofErr w:type="spellStart"/>
+      <w:r>
+        <w:rPr>
+          <w:b/>
+          <w:bCs/>
+          <w:lang w:val="en-US"/>
+        </w:rPr>
+        <w:t>recomposition</w:t>
+      </w:r>
+      <w:proofErr w:type="spellEnd"/>
+      <w:r>
+        <w:rPr>
+          <w:b/>
+          <w:bCs/>
+          <w:lang w:val="en-US"/>
+        </w:rPr>
+        <w:t xml:space="preserve"> without bad components and output save</w:t>
       </w:r>
     </w:p>
     <w:p>
@@ -1405,7 +1636,25 @@
           <w:iCs/>
           <w:lang w:val="en-US"/>
         </w:rPr>
-        <w:t>'ICAtemp\decomposed'</w:t>
+        <w:t>'</w:t>
+      </w:r>
+      <w:proofErr w:type="spellStart"/>
+      <w:r>
+        <w:rPr>
+          <w:i/>
+          <w:iCs/>
+          <w:lang w:val="en-US"/>
+        </w:rPr>
+        <w:t>ICAtemp</w:t>
+      </w:r>
+      <w:proofErr w:type="spellEnd"/>
+      <w:r>
+        <w:rPr>
+          <w:i/>
+          <w:iCs/>
+          <w:lang w:val="en-US"/>
+        </w:rPr>
+        <w:t>\decomposed'</w:t>
       </w:r>
       <w:r>
         <w:rPr>
@@ -1485,12 +1734,21 @@
         </w:rPr>
         <w:t xml:space="preserve"> will carry out the </w:t>
       </w:r>
-      <w:r>
-        <w:rPr>
-          <w:rFonts w:ascii="Calibri" w:hAnsi="Calibri" w:cs="Calibri"/>
-          <w:lang w:val="en-US"/>
-        </w:rPr>
-        <w:t xml:space="preserve">recomposition </w:t>
+      <w:proofErr w:type="spellStart"/>
+      <w:r>
+        <w:rPr>
+          <w:rFonts w:ascii="Calibri" w:hAnsi="Calibri" w:cs="Calibri"/>
+          <w:lang w:val="en-US"/>
+        </w:rPr>
+        <w:t>recomposition</w:t>
+      </w:r>
+      <w:proofErr w:type="spellEnd"/>
+      <w:r>
+        <w:rPr>
+          <w:rFonts w:ascii="Calibri" w:hAnsi="Calibri" w:cs="Calibri"/>
+          <w:lang w:val="en-US"/>
+        </w:rPr>
+        <w:t xml:space="preserve"> </w:t>
       </w:r>
       <w:r>
         <w:rPr>
@@ -1719,12 +1977,14 @@
         </w:rPr>
         <w:t xml:space="preserve">The </w:t>
       </w:r>
+      <w:proofErr w:type="spellStart"/>
       <w:r>
         <w:rPr>
           <w:lang w:val="en-US"/>
         </w:rPr>
         <w:t>eeglab</w:t>
       </w:r>
+      <w:proofErr w:type="spellEnd"/>
       <w:r>
         <w:rPr>
           <w:lang w:val="en-US"/>
@@ -1898,11 +2158,19 @@
           <w:lang w:val="en-US"/>
         </w:rPr>
       </w:pPr>
-      <w:r>
-        <w:rPr>
-          <w:lang w:val="en-US"/>
-        </w:rPr>
-        <w:t xml:space="preserve">Foe example, in </w:t>
+      <w:proofErr w:type="spellStart"/>
+      <w:r>
+        <w:rPr>
+          <w:lang w:val="en-US"/>
+        </w:rPr>
+        <w:t>Foe</w:t>
+      </w:r>
+      <w:proofErr w:type="spellEnd"/>
+      <w:r>
+        <w:rPr>
+          <w:lang w:val="en-US"/>
+        </w:rPr>
+        <w:t xml:space="preserve"> example, in </w:t>
       </w:r>
       <w:r>
         <w:rPr>
@@ -1931,11 +2199,33 @@
           <w:lang w:val="en-US"/>
         </w:rPr>
       </w:pPr>
-      <w:r>
-        <w:rPr>
-          <w:lang w:val="en-US"/>
-        </w:rPr>
-        <w:t>Armaud Delmare (</w:t>
+      <w:proofErr w:type="spellStart"/>
+      <w:r>
+        <w:rPr>
+          <w:lang w:val="en-US"/>
+        </w:rPr>
+        <w:t>Armaud</w:t>
+      </w:r>
+      <w:proofErr w:type="spellEnd"/>
+      <w:r>
+        <w:rPr>
+          <w:lang w:val="en-US"/>
+        </w:rPr>
+        <w:t xml:space="preserve"> </w:t>
+      </w:r>
+      <w:proofErr w:type="spellStart"/>
+      <w:r>
+        <w:rPr>
+          <w:lang w:val="en-US"/>
+        </w:rPr>
+        <w:t>Delmare</w:t>
+      </w:r>
+      <w:proofErr w:type="spellEnd"/>
+      <w:r>
+        <w:rPr>
+          <w:lang w:val="en-US"/>
+        </w:rPr>
+        <w:t xml:space="preserve"> (</w:t>
       </w:r>
       <w:hyperlink r:id="rId10" w:history="1">
         <w:r>
@@ -1999,13 +2289,55 @@
         <w:rPr>
           <w:lang w:val="en-US"/>
         </w:rPr>
-        <w:t xml:space="preserve"> Eeglab use different electrodes coordinates orientation. </w:t>
-      </w:r>
-      <w:r>
-        <w:rPr>
-          <w:lang w:val="en-US"/>
-        </w:rPr>
-        <w:t xml:space="preserve">This could happen if you create your own electrode coordinate file based on coordinates extracted from EEGlab. This should not happen if you use a coordinate file from the EEGpal </w:t>
+        <w:t xml:space="preserve"> </w:t>
+      </w:r>
+      <w:proofErr w:type="spellStart"/>
+      <w:r>
+        <w:rPr>
+          <w:lang w:val="en-US"/>
+        </w:rPr>
+        <w:t>Eeglab</w:t>
+      </w:r>
+      <w:proofErr w:type="spellEnd"/>
+      <w:r>
+        <w:rPr>
+          <w:lang w:val="en-US"/>
+        </w:rPr>
+        <w:t xml:space="preserve"> use different electrodes coordinates orientation. </w:t>
+      </w:r>
+      <w:r>
+        <w:rPr>
+          <w:lang w:val="en-US"/>
+        </w:rPr>
+        <w:t xml:space="preserve">This could happen if you create your own electrode coordinate file based on coordinates extracted from </w:t>
+      </w:r>
+      <w:proofErr w:type="spellStart"/>
+      <w:r>
+        <w:rPr>
+          <w:lang w:val="en-US"/>
+        </w:rPr>
+        <w:t>EEGlab</w:t>
+      </w:r>
+      <w:proofErr w:type="spellEnd"/>
+      <w:r>
+        <w:rPr>
+          <w:lang w:val="en-US"/>
+        </w:rPr>
+        <w:t xml:space="preserve">. This should not happen if you use a coordinate file from the </w:t>
+      </w:r>
+      <w:proofErr w:type="spellStart"/>
+      <w:r>
+        <w:rPr>
+          <w:lang w:val="en-US"/>
+        </w:rPr>
+        <w:t>EEGpal</w:t>
+      </w:r>
+      <w:proofErr w:type="spellEnd"/>
+      <w:r>
+        <w:rPr>
+          <w:lang w:val="en-US"/>
+        </w:rPr>
+        <w:t xml:space="preserve"> </w:t>
       </w:r>
       <w:r>
         <w:rPr>
@@ -2127,7 +2459,21 @@
         <w:rPr>
           <w:lang w:val="en-US"/>
         </w:rPr>
-        <w:t xml:space="preserve"> in the main EEGpal window. </w:t>
+        <w:t xml:space="preserve"> in the main </w:t>
+      </w:r>
+      <w:proofErr w:type="spellStart"/>
+      <w:r>
+        <w:rPr>
+          <w:lang w:val="en-US"/>
+        </w:rPr>
+        <w:t>EEGpal</w:t>
+      </w:r>
+      <w:proofErr w:type="spellEnd"/>
+      <w:r>
+        <w:rPr>
+          <w:lang w:val="en-US"/>
+        </w:rPr>
+        <w:t xml:space="preserve"> window. </w:t>
       </w:r>
     </w:p>
     <w:p>
@@ -2158,7 +2504,21 @@
         <w:rPr>
           <w:lang w:val="en-US"/>
         </w:rPr>
-        <w:t>As can be seen in the first components of this example, the frontal positivity associated with the eye blink is shifted by 90°. This is a typical example of a problem with the electrode coordinate file. You can see that the ICALabel proposition is incorrect because it incorrectly attributes the component to the brain instead of the eye.</w:t>
+        <w:t xml:space="preserve">As can be seen in the first components of this example, the frontal positivity associated with the eye blink is shifted by 90°. This is a typical example of a problem with the electrode coordinate file. You can see that the </w:t>
+      </w:r>
+      <w:proofErr w:type="spellStart"/>
+      <w:r>
+        <w:rPr>
+          <w:lang w:val="en-US"/>
+        </w:rPr>
+        <w:t>ICALabel</w:t>
+      </w:r>
+      <w:proofErr w:type="spellEnd"/>
+      <w:r>
+        <w:rPr>
+          <w:lang w:val="en-US"/>
+        </w:rPr>
+        <w:t xml:space="preserve"> proposition is incorrect because it incorrectly attributes the component to the brain instead of the eye.</w:t>
       </w:r>
     </w:p>
     <w:p>
@@ -2185,22 +2545,42 @@
           <w:iCs/>
           <w:lang w:val="en-US"/>
         </w:rPr>
-        <w:t>*.xyz</w:t>
-      </w:r>
-      <w:r>
-        <w:rPr>
-          <w:lang w:val="en-US"/>
-        </w:rPr>
-        <w:t xml:space="preserve"> electrode coordinate file. Open the file with Excel and invert the position of the first column (position X) and the second column (position y) as shown in the figure. Save your file with .txt with Tab as delimiter. Then rename the file extension to be </w:t>
-      </w:r>
+        <w:t>*.</w:t>
+      </w:r>
+      <w:proofErr w:type="spellStart"/>
       <w:r>
         <w:rPr>
           <w:i/>
           <w:iCs/>
           <w:lang w:val="en-US"/>
         </w:rPr>
-        <w:t>*.xyz</w:t>
-      </w:r>
+        <w:t>xyz</w:t>
+      </w:r>
+      <w:proofErr w:type="spellEnd"/>
+      <w:r>
+        <w:rPr>
+          <w:lang w:val="en-US"/>
+        </w:rPr>
+        <w:t xml:space="preserve"> electrode coordinate file. Open the file with Excel and invert the position of the first column (position X) and the second column (position y) as shown in the figure. Save your file with .txt with Tab as delimiter. Then rename the file extension to be </w:t>
+      </w:r>
+      <w:r>
+        <w:rPr>
+          <w:i/>
+          <w:iCs/>
+          <w:lang w:val="en-US"/>
+        </w:rPr>
+        <w:t>*.</w:t>
+      </w:r>
+      <w:proofErr w:type="spellStart"/>
+      <w:r>
+        <w:rPr>
+          <w:i/>
+          <w:iCs/>
+          <w:lang w:val="en-US"/>
+        </w:rPr>
+        <w:t>xyz</w:t>
+      </w:r>
+      <w:proofErr w:type="spellEnd"/>
       <w:r>
         <w:rPr>
           <w:lang w:val="en-US"/>
@@ -2246,7 +2626,21 @@
         <w:rPr>
           <w:lang w:val="en-US"/>
         </w:rPr>
-        <w:t xml:space="preserve"> in the main EEGpal window. </w:t>
+        <w:t xml:space="preserve"> in the main </w:t>
+      </w:r>
+      <w:proofErr w:type="spellStart"/>
+      <w:r>
+        <w:rPr>
+          <w:lang w:val="en-US"/>
+        </w:rPr>
+        <w:t>EEGpal</w:t>
+      </w:r>
+      <w:proofErr w:type="spellEnd"/>
+      <w:r>
+        <w:rPr>
+          <w:lang w:val="en-US"/>
+        </w:rPr>
+        <w:t xml:space="preserve"> window. </w:t>
       </w:r>
     </w:p>
     <w:p>
@@ -2265,7 +2659,21 @@
         <w:rPr>
           <w:lang w:val="en-US"/>
         </w:rPr>
-        <w:t>Reperform the ICA decomposition on your original file and examine the topography of the components. Pay special attention to the eye compound from the vertical eye blink. As you can see here, the problem has been solved and the ICALabel proposition is correct.</w:t>
+        <w:t xml:space="preserve">Reperform the ICA decomposition on your original file and examine the topography of the components. Pay special attention to the eye compound from the vertical eye blink. As you can see here, the problem has been solved and the </w:t>
+      </w:r>
+      <w:proofErr w:type="spellStart"/>
+      <w:r>
+        <w:rPr>
+          <w:lang w:val="en-US"/>
+        </w:rPr>
+        <w:t>ICALabel</w:t>
+      </w:r>
+      <w:proofErr w:type="spellEnd"/>
+      <w:r>
+        <w:rPr>
+          <w:lang w:val="en-US"/>
+        </w:rPr>
+        <w:t xml:space="preserve"> proposition is correct.</w:t>
       </w:r>
     </w:p>
     <w:sectPr>

</xml_diff>